<commit_message>
CS1103 Unit 7 discussion: cover networking interfaces, cite timeouts, unit-linked question
Co-Authored-By: Claude Opus 5.5 <noreply@anthropic.com>
</commit_message>
<xml_diff>
--- a/CS1103_Programming_2/Unit7_Files_Networking/Discussion/Unit7_Discussion_Post.docx
+++ b/CS1103_Programming_2/Unit7_Files_Networking/Discussion/Unit7_Discussion_Post.docx
@@ -28,7 +28,7 @@
           <w:i w:val="0"/>
           <w:sz w:val="24"/>
         </w:rPr>
-        <w:t>In a file-sharing application, two things must never fail silently: a file must arrive complete and unchanged, and one user's problem must not break the service for everyone else. Building a multi-user chat server with sockets this week shaped the strategies below.</w:t>
+        <w:t>A file-sharing application must deliver every file complete and unchanged, and one user's problem must never affect anyone else. Building a multi-user chat server this week shaped my strategies.</w:t>
       </w:r>
     </w:p>
     <w:p>
@@ -66,7 +66,7 @@
           <w:i w:val="0"/>
           <w:sz w:val="24"/>
         </w:rPr>
-        <w:t xml:space="preserve"> Users share photos, PDFs, and ZIP archives, not only text, so I would read and write with the byte streams FileInputStream and FileOutputStream. Eck (2022, Section 11.3) makes the same choice for his file-copy program, because a program that copies any file cannot assume the data is human-readable. Character streams such as FileReader are only for text (Codex, 2023).</w:t>
+        <w:t xml:space="preserve"> Shared files are often photos or ZIP archives, so I would use the byte streams FileInputStream and FileOutputStream. Eck (2022, Section 11.3) makes the same choice for his file-copy program, because a program that copies any file cannot assume the data is human-readable. Character streams such as FileReader are only for text (Codex, 2023).</w:t>
       </w:r>
     </w:p>
     <w:p>
@@ -89,7 +89,7 @@
           <w:i w:val="0"/>
           <w:sz w:val="24"/>
         </w:rPr>
-        <w:t xml:space="preserve"> I would wrap the streams in BufferedInputStream and BufferedOutputStream and copy through an 8 KB array. Buffered streams read data in chunks into an internal buffer, which keeps memory use low on large files (Codex, 2023). Memory stays flat even for an 8 GB file, and each read moves thousands of bytes instead of the single byte in Eck's teaching example.</w:t>
+        <w:t xml:space="preserve"> I would wrap the streams in BufferedInputStream and BufferedOutputStream and copy through an 8 KB array. Buffered streams read data in chunks into an internal buffer, which keeps memory use low on large files (Codex, 2023), unlike Eck's teaching example, which copies one byte at a time.</w:t>
       </w:r>
     </w:p>
     <w:p>
@@ -135,7 +135,7 @@
           <w:i w:val="0"/>
           <w:sz w:val="24"/>
         </w:rPr>
-        <w:t xml:space="preserve"> A download goes into a temporary .part file first. Only when every byte has arrived is it renamed with Files.move and the ATOMIC_MOVE option, which performs the move as a single file-system operation (Oracle, n.d.-b). A half-finished download can never be mistaken for the real file.</w:t>
+        <w:t xml:space="preserve"> Downloads go into a temporary .part file, which is renamed with Files.move and ATOMIC_MOVE, a single file-system operation (Oracle, n.d.-b), only when every byte has arrived. A half-finished download can never be mistaken for the real file.</w:t>
       </w:r>
     </w:p>
     <w:p>
@@ -158,7 +158,7 @@
           <w:i w:val="0"/>
           <w:sz w:val="24"/>
         </w:rPr>
-        <w:t xml:space="preserve"> I would open every stream in a try-with-resources block so it is closed even when an exception occurs, and catch FileNotFoundException separately from other IOExceptions so the user sees "file not found" rather than a generic failure. Eck (2022, Section 11.1) also points out that PrintWriter methods never throw an IOException, so its checkError() method must be called to detect write errors. That matters for the small text index of shared files, which I would write with BufferedWriter and read back line by line with BufferedReader, as Coding with John (2021) demonstrates.</w:t>
+        <w:t xml:space="preserve"> Every stream opens in a try-with-resources block so it closes even after an exception, and FileNotFoundException is caught separately from other IOExceptions to give the user a specific message. Eck (2022, Section 11.1) also points out that PrintWriter methods never throw an IOException, so its checkError() method must be called to detect write errors. That matters for the small text index of shared files, which I would write with BufferedWriter and read back line by line with BufferedReader, as Coding with John (2021) demonstrates.</w:t>
       </w:r>
     </w:p>
     <w:p>
@@ -196,7 +196,30 @@
           <w:i w:val="0"/>
           <w:sz w:val="24"/>
         </w:rPr>
-        <w:t xml:space="preserve"> The server listens with a ServerSocket and calls accept(); each user connects with a Socket. Both use TCP, which Eck (2022, Section 11.4) describes as reliable two-way communication, so bytes arrive in order or the connection fails visibly. As in my chat server and in Kumar's (2022) example, the socket's streams are then used exactly like file streams. Unlike Kumar's single-client example, I would give each connection its own thread from a thread pool, so a slow upload never blocks other users.</w:t>
+        <w:t xml:space="preserve"> The server listens with a ServerSocket and calls accept(); each user connects with a Socket. Both use TCP, which Eck (2022, Section 11.4) describes as reliable two-way communication, so bytes arrive in order or the connection fails visibly. As in Kumar's (2022) example, the socket's streams are then used like file streams, but unlike his single-client server, mine gives each connection its own pooled thread, so a slow upload never blocks other users.</w:t>
+      </w:r>
+    </w:p>
+    <w:p>
+      <w:pPr>
+        <w:spacing w:line="360" w:lineRule="auto" w:after="200"/>
+      </w:pPr>
+      <w:r>
+        <w:rPr>
+          <w:rFonts w:ascii="Times New Roman" w:hAnsi="Times New Roman"/>
+          <w:b/>
+          <w:i w:val="0"/>
+          <w:sz w:val="24"/>
+        </w:rPr>
+        <w:t>Interfaces that hold it together.</w:t>
+      </w:r>
+      <w:r>
+        <w:rPr>
+          <w:rFonts w:ascii="Times New Roman" w:hAnsi="Times New Roman"/>
+          <w:b w:val="0"/>
+          <w:i w:val="0"/>
+          <w:sz w:val="24"/>
+        </w:rPr>
+        <w:t xml:space="preserve"> Socket and ServerSocket implement the Closeable interface, so they work in try-with-resources and are closed even after an error (Oracle, n.d.-c). Each connection handler implements Runnable so the thread pool can run it, and DataInputStream implements the DataInput interface, which defines readFully() and the other typed read methods (Oracle, n.d.-a). Since DataInputStream is not safe for concurrent threads, each connection keeps its own streams.</w:t>
       </w:r>
     </w:p>
     <w:p>
@@ -219,7 +242,7 @@
           <w:i w:val="0"/>
           <w:sz w:val="24"/>
         </w:rPr>
-        <w:t xml:space="preserve"> A file needs a simple protocol. I would wrap the socket streams in DataOutputStream and DataInputStream, then send the file name with writeUTF(), the size with writeLong(), and finally the bytes. The receiver reads exactly that many bytes. If the connection drops early, readFully() throws an EOFException instead of returning a partial file (Oracle, n.d.-a). For downloads from a web mirror, URL and URLConnection give an input stream in a few lines (Eck, 2022, Section 11.4).</w:t>
+        <w:t xml:space="preserve"> I would wrap the socket streams in DataOutputStream and DataInputStream, then send the file name with writeUTF(), the size with writeLong(), and finally the bytes. The receiver reads exactly that many bytes. If the connection drops early, readFully() throws an EOFException instead of returning a partial file (Oracle, n.d.-a). For downloads from a web mirror, URL and URLConnection give an input stream in a few lines (Eck, 2022, Section 11.4).</w:t>
       </w:r>
     </w:p>
     <w:p>
@@ -242,7 +265,7 @@
           <w:i w:val="0"/>
           <w:sz w:val="24"/>
         </w:rPr>
-        <w:t xml:space="preserve"> I would set a read timeout with setSoTimeout() so a stalled client cannot hold a thread forever, limit the maximum file size, compare a SHA-256 checksum after each transfer, and let an interrupted download resume from the size of the .part file.</w:t>
+        <w:t xml:space="preserve"> I would set a read timeout with setSoTimeout(), so a stalled read throws a SocketTimeoutException instead of holding a thread forever (Oracle, n.d.-c). I would also limit the maximum file size, compare a SHA-256 checksum after each transfer, and let an interrupted download resume from the size of the .part file.</w:t>
       </w:r>
     </w:p>
     <w:p>
@@ -265,7 +288,7 @@
           <w:i w:val="0"/>
           <w:sz w:val="24"/>
         </w:rPr>
-        <w:t xml:space="preserve"> Plain sockets send data unencrypted. SSLSocket and SSLServerSocket extend the normal socket classes with TLS, which protects data against eavesdropping and modification and lets the client authenticate the server (Oracle, n.d.-c). The server must also distrust file names: a name such as ../../etc/passwd is a path traversal attack that tries to reach files outside the shared folder (OWASP Foundation, n.d.). I would normalize every requested path and reject any that does not stay inside the shared directory, and require users to log in before they can upload.</w:t>
+        <w:t xml:space="preserve"> Plain sockets send data unencrypted. SSLSocket and SSLServerSocket extend the normal socket classes with TLS, which protects data against eavesdropping and modification and lets the client authenticate the server (Oracle, n.d.-d). The server must also distrust file names: a name such as ../../etc/passwd is a path traversal attack that tries to reach files outside the shared folder (OWASP Foundation, n.d.). I would normalize every requested path, reject any outside the shared directory, and require users to log in before uploading.</w:t>
       </w:r>
     </w:p>
     <w:p>
@@ -288,7 +311,7 @@
           <w:i w:val="0"/>
           <w:sz w:val="24"/>
         </w:rPr>
-        <w:t xml:space="preserve"> For large file transfers, would you use one connection per file with blocking sockets and a thread pool, or a single non-blocking connection (java.nio channels) that handles many transfers at once? Which trade-offs drive your choice?</w:t>
+        <w:t xml:space="preserve"> For a file-sharing application, would you transfer files over a raw Socket with your own protocol, or over HTTP using URL and URLConnection? What would you gain or lose in robustness and security with each choice?</w:t>
       </w:r>
     </w:p>
     <w:p>
@@ -302,7 +325,7 @@
           <w:i w:val="0"/>
           <w:sz w:val="24"/>
         </w:rPr>
-        <w:t>Word count: 736</w:t>
+        <w:t>Word count: 743</w:t>
       </w:r>
     </w:p>
     <w:p>
@@ -654,6 +677,50 @@
           <w:i/>
           <w:sz w:val="24"/>
         </w:rPr>
+        <w:t>Class Socket</w:t>
+      </w:r>
+      <w:r>
+        <w:rPr>
+          <w:rFonts w:ascii="Times New Roman" w:hAnsi="Times New Roman"/>
+          <w:b w:val="0"/>
+          <w:i w:val="0"/>
+          <w:sz w:val="24"/>
+        </w:rPr>
+        <w:t xml:space="preserve">. Java SE 21 &amp; JDK 21 API documentation. </w:t>
+      </w:r>
+      <w:hyperlink r:id="rId17">
+        <w:r>
+          <w:rPr>
+            <w:rFonts w:ascii="Times New Roman" w:hAnsi="Times New Roman"/>
+            <w:color w:val="0563C1"/>
+            <w:u w:val="single"/>
+            <w:sz w:val="24"/>
+          </w:rPr>
+          <w:t>https://docs.oracle.com/en/java/javase/21/docs/api/java.base/java/net/Socket.html</w:t>
+        </w:r>
+      </w:hyperlink>
+    </w:p>
+    <w:p>
+      <w:pPr>
+        <w:spacing w:line="360" w:lineRule="auto" w:after="0"/>
+        <w:ind w:left="720" w:hanging="720"/>
+      </w:pPr>
+      <w:r>
+        <w:rPr>
+          <w:rFonts w:ascii="Times New Roman" w:hAnsi="Times New Roman"/>
+          <w:b w:val="0"/>
+          <w:i w:val="0"/>
+          <w:sz w:val="24"/>
+        </w:rPr>
+        <w:t xml:space="preserve">Oracle. (n.d.-d). </w:t>
+      </w:r>
+      <w:r>
+        <w:rPr>
+          <w:rFonts w:ascii="Times New Roman" w:hAnsi="Times New Roman"/>
+          <w:b w:val="0"/>
+          <w:i/>
+          <w:sz w:val="24"/>
+        </w:rPr>
         <w:t>Class SSLSocket</w:t>
       </w:r>
       <w:r>
@@ -665,7 +732,7 @@
         </w:rPr>
         <w:t xml:space="preserve">. Java SE 21 &amp; JDK 21 API documentation. </w:t>
       </w:r>
-      <w:hyperlink r:id="rId17">
+      <w:hyperlink r:id="rId18">
         <w:r>
           <w:rPr>
             <w:rFonts w:ascii="Times New Roman" w:hAnsi="Times New Roman"/>
@@ -709,7 +776,7 @@
         </w:rPr>
         <w:t xml:space="preserve">. </w:t>
       </w:r>
-      <w:hyperlink r:id="rId18">
+      <w:hyperlink r:id="rId19">
         <w:r>
           <w:rPr>
             <w:rFonts w:ascii="Times New Roman" w:hAnsi="Times New Roman"/>

</xml_diff>